<commit_message>
Add college logo and refine report typography
</commit_message>
<xml_diff>
--- a/docs/report/Compiler_Design_TEC_Report.docx
+++ b/docs/report/Compiler_Design_TEC_Report.docx
@@ -18,6 +18,46 @@
           <w:sz w:val="32"/>
         </w:rPr>
         <w:t>SHRI SANT GAJANAN MAHARAJ COLLEGE OF ENGINEERING, SHEGAON</w:t>
+      </w:r>
+    </w:p>
+    <w:p>
+      <w:pPr>
+        <w:spacing w:before="80" w:after="140"/>
+        <w:jc w:val="center"/>
+      </w:pPr>
+      <w:r>
+        <w:drawing>
+          <wp:inline xmlns:a="http://schemas.openxmlformats.org/drawingml/2006/main" xmlns:pic="http://schemas.openxmlformats.org/drawingml/2006/picture">
+            <wp:extent cx="1024128" cy="788855"/>
+            <wp:docPr id="1" name="Picture 1"/>
+            <wp:cNvGraphicFramePr>
+              <a:graphicFrameLocks noChangeAspect="1"/>
+            </wp:cNvGraphicFramePr>
+            <a:graphic>
+              <a:graphicData uri="http://schemas.openxmlformats.org/drawingml/2006/picture">
+                <pic:pic>
+                  <pic:nvPicPr>
+                    <pic:cNvPr id="0" name="ssgmce-logo.png"/>
+                    <pic:cNvPicPr/>
+                  </pic:nvPicPr>
+                  <pic:blipFill>
+                    <a:blip r:embed="rId10"/>
+                    <a:stretch>
+                      <a:fillRect/>
+                    </a:stretch>
+                  </pic:blipFill>
+                  <pic:spPr>
+                    <a:xfrm>
+                      <a:off x="0" y="0"/>
+                      <a:ext cx="1024128" cy="788855"/>
+                    </a:xfrm>
+                    <a:prstGeom prst="rect"/>
+                  </pic:spPr>
+                </pic:pic>
+              </a:graphicData>
+            </a:graphic>
+          </wp:inline>
+        </w:drawing>
       </w:r>
     </w:p>
     <w:p>
@@ -2644,7 +2684,7 @@
         <w:drawing>
           <wp:inline xmlns:a="http://schemas.openxmlformats.org/drawingml/2006/main" xmlns:pic="http://schemas.openxmlformats.org/drawingml/2006/picture">
             <wp:extent cx="5212080" cy="3322701"/>
-            <wp:docPr id="1" name="Picture 1"/>
+            <wp:docPr id="2" name="Picture 2"/>
             <wp:cNvGraphicFramePr>
               <a:graphicFrameLocks noChangeAspect="1"/>
             </wp:cNvGraphicFramePr>
@@ -2656,7 +2696,7 @@
                     <pic:cNvPicPr/>
                   </pic:nvPicPr>
                   <pic:blipFill>
-                    <a:blip r:embed="rId10"/>
+                    <a:blip r:embed="rId11"/>
                     <a:stretch>
                       <a:fillRect/>
                     </a:stretch>
@@ -3368,7 +3408,7 @@
         <w:drawing>
           <wp:inline xmlns:a="http://schemas.openxmlformats.org/drawingml/2006/main" xmlns:pic="http://schemas.openxmlformats.org/drawingml/2006/picture">
             <wp:extent cx="4297680" cy="4154424"/>
-            <wp:docPr id="2" name="Picture 2"/>
+            <wp:docPr id="3" name="Picture 3"/>
             <wp:cNvGraphicFramePr>
               <a:graphicFrameLocks noChangeAspect="1"/>
             </wp:cNvGraphicFramePr>
@@ -3380,7 +3420,7 @@
                     <pic:cNvPicPr/>
                   </pic:nvPicPr>
                   <pic:blipFill>
-                    <a:blip r:embed="rId11"/>
+                    <a:blip r:embed="rId12"/>
                     <a:stretch>
                       <a:fillRect/>
                     </a:stretch>
@@ -4713,7 +4753,7 @@
         <w:drawing>
           <wp:inline xmlns:a="http://schemas.openxmlformats.org/drawingml/2006/main" xmlns:pic="http://schemas.openxmlformats.org/drawingml/2006/picture">
             <wp:extent cx="5715000" cy="5298281"/>
-            <wp:docPr id="3" name="Picture 3"/>
+            <wp:docPr id="4" name="Picture 4"/>
             <wp:cNvGraphicFramePr>
               <a:graphicFrameLocks noChangeAspect="1"/>
             </wp:cNvGraphicFramePr>
@@ -4725,7 +4765,7 @@
                     <pic:cNvPicPr/>
                   </pic:nvPicPr>
                   <pic:blipFill>
-                    <a:blip r:embed="rId12"/>
+                    <a:blip r:embed="rId13"/>
                     <a:stretch>
                       <a:fillRect/>
                     </a:stretch>
@@ -4787,7 +4827,7 @@
         <w:drawing>
           <wp:inline xmlns:a="http://schemas.openxmlformats.org/drawingml/2006/main" xmlns:pic="http://schemas.openxmlformats.org/drawingml/2006/picture">
             <wp:extent cx="5715000" cy="5246688"/>
-            <wp:docPr id="4" name="Picture 4"/>
+            <wp:docPr id="5" name="Picture 5"/>
             <wp:cNvGraphicFramePr>
               <a:graphicFrameLocks noChangeAspect="1"/>
             </wp:cNvGraphicFramePr>
@@ -4799,7 +4839,7 @@
                     <pic:cNvPicPr/>
                   </pic:nvPicPr>
                   <pic:blipFill>
-                    <a:blip r:embed="rId13"/>
+                    <a:blip r:embed="rId14"/>
                     <a:stretch>
                       <a:fillRect/>
                     </a:stretch>
@@ -8385,7 +8425,8 @@
       <w:spacing w:after="140" w:line="307" w:lineRule="auto"/>
     </w:pPr>
     <w:rPr>
-      <w:rFonts w:ascii="Times New Roman" w:hAnsi="Times New Roman" w:eastAsia="Times New Roman"/>
+      <w:rFonts w:ascii="Times New Roman" w:hAnsi="Times New Roman" w:eastAsia="Times New Roman" w:cs="Times New Roman"/>
+      <w:b w:val="0"/>
       <w:color w:val="19232D"/>
       <w:sz w:val="22"/>
     </w:rPr>
@@ -8449,11 +8490,11 @@
       <w:outlineLvl w:val="0"/>
     </w:pPr>
     <w:rPr>
-      <w:rFonts w:asciiTheme="majorHAnsi" w:eastAsiaTheme="majorEastAsia" w:hAnsiTheme="majorHAnsi" w:cstheme="majorBidi" w:ascii="Times New Roman" w:hAnsi="Times New Roman" w:eastAsia="Times New Roman"/>
+      <w:rFonts w:ascii="Times New Roman" w:hAnsi="Times New Roman" w:eastAsia="Times New Roman" w:cs="Times New Roman"/>
       <w:b/>
       <w:bCs/>
-      <w:color w:val="19232D"/>
-      <w:sz w:val="30"/>
+      <w:color w:val="000000"/>
+      <w:sz w:val="28"/>
       <w:szCs w:val="28"/>
     </w:rPr>
   </w:style>
@@ -8473,11 +8514,11 @@
       <w:outlineLvl w:val="1"/>
     </w:pPr>
     <w:rPr>
-      <w:rFonts w:asciiTheme="majorHAnsi" w:eastAsiaTheme="majorEastAsia" w:hAnsiTheme="majorHAnsi" w:cstheme="majorBidi" w:ascii="Times New Roman" w:hAnsi="Times New Roman" w:eastAsia="Times New Roman"/>
+      <w:rFonts w:ascii="Times New Roman" w:hAnsi="Times New Roman" w:eastAsia="Times New Roman" w:cs="Times New Roman"/>
       <w:b/>
       <w:bCs/>
-      <w:color w:val="19232D"/>
-      <w:sz w:val="25"/>
+      <w:color w:val="000000"/>
+      <w:sz w:val="24"/>
       <w:szCs w:val="26"/>
     </w:rPr>
   </w:style>
@@ -8497,11 +8538,11 @@
       <w:outlineLvl w:val="2"/>
     </w:pPr>
     <w:rPr>
-      <w:rFonts w:asciiTheme="majorHAnsi" w:eastAsiaTheme="majorEastAsia" w:hAnsiTheme="majorHAnsi" w:cstheme="majorBidi" w:ascii="Times New Roman" w:hAnsi="Times New Roman" w:eastAsia="Times New Roman"/>
+      <w:rFonts w:ascii="Times New Roman" w:hAnsi="Times New Roman" w:eastAsia="Times New Roman" w:cs="Times New Roman"/>
       <w:b/>
       <w:bCs/>
-      <w:color w:val="19232D"/>
-      <w:sz w:val="23"/>
+      <w:color w:val="000000"/>
+      <w:sz w:val="22"/>
     </w:rPr>
   </w:style>
   <w:style w:type="paragraph" w:styleId="Heading4">
@@ -8919,6 +8960,12 @@
       </w:numPr>
       <w:contextualSpacing/>
     </w:pPr>
+    <w:rPr>
+      <w:rFonts w:ascii="Times New Roman" w:hAnsi="Times New Roman" w:eastAsia="Times New Roman" w:cs="Times New Roman"/>
+      <w:b w:val="0"/>
+      <w:color w:val="000000"/>
+      <w:sz w:val="22"/>
+    </w:rPr>
   </w:style>
   <w:style w:type="paragraph" w:styleId="ListBullet2">
     <w:name w:val="List Bullet 2"/>
@@ -8958,6 +9005,12 @@
       </w:numPr>
       <w:contextualSpacing/>
     </w:pPr>
+    <w:rPr>
+      <w:rFonts w:ascii="Times New Roman" w:hAnsi="Times New Roman" w:eastAsia="Times New Roman" w:cs="Times New Roman"/>
+      <w:b w:val="0"/>
+      <w:color w:val="000000"/>
+      <w:sz w:val="22"/>
+    </w:rPr>
   </w:style>
   <w:style w:type="paragraph" w:styleId="ListNumber2">
     <w:name w:val="List Number 2"/>

</xml_diff>

<commit_message>
Fill report cover student and submission details
</commit_message>
<xml_diff>
--- a/docs/report/Compiler_Design_TEC_Report.docx
+++ b/docs/report/Compiler_Design_TEC_Report.docx
@@ -140,7 +140,7 @@
         <w:jc w:val="center"/>
       </w:pPr>
       <w:r>
-        <w:t>Kartik Bhaskar Hande</w:t>
+        <w:t>Kartik Bhaskar Hande — Roll No. 50</w:t>
       </w:r>
     </w:p>
     <w:p>
@@ -149,7 +149,7 @@
         <w:jc w:val="center"/>
       </w:pPr>
       <w:r>
-        <w:t>Armaan Ramprakash Gupta</w:t>
+        <w:t>Armaan Ramprakash Gupta — Roll No. 40</w:t>
       </w:r>
     </w:p>
     <w:p>
@@ -158,7 +158,7 @@
         <w:jc w:val="center"/>
       </w:pPr>
       <w:r>
-        <w:t>Devesh Girish Talatule</w:t>
+        <w:t>Devesh Girish Talatule — Roll No. 45</w:t>
       </w:r>
     </w:p>
     <w:p>
@@ -167,7 +167,7 @@
         <w:jc w:val="center"/>
       </w:pPr>
       <w:r>
-        <w:t>Divyansh Vijay Mate</w:t>
+        <w:t>Divyansh Vijay Mate — Roll No. 44</w:t>
       </w:r>
     </w:p>
     <w:p>
@@ -181,7 +181,7 @@
         <w:jc w:val="center"/>
       </w:pPr>
       <w:r>
-        <w:t>Roll numbers: [To be filled by the students]</w:t>
+        <w:t>Project guide: Prof. C. V. Manakar</w:t>
       </w:r>
     </w:p>
     <w:p>
@@ -189,15 +189,7 @@
         <w:jc w:val="center"/>
       </w:pPr>
       <w:r>
-        <w:t>Project guide: [To be filled]</w:t>
-      </w:r>
-    </w:p>
-    <w:p>
-      <w:pPr>
-        <w:jc w:val="center"/>
-      </w:pPr>
-      <w:r>
-        <w:t>Submission date: [To be filled]</w:t>
+        <w:t>Submission date: 30 October 2026</w:t>
       </w:r>
     </w:p>
     <w:p>

</xml_diff>

<commit_message>
Correct final student roll numbers on report cover
</commit_message>
<xml_diff>
--- a/docs/report/Compiler_Design_TEC_Report.docx
+++ b/docs/report/Compiler_Design_TEC_Report.docx
@@ -158,7 +158,7 @@
         <w:jc w:val="center"/>
       </w:pPr>
       <w:r>
-        <w:t>Devesh Girish Talatule — Roll No. 45</w:t>
+        <w:t>Devesh Girish Talatule — Roll No. 44</w:t>
       </w:r>
     </w:p>
     <w:p>
@@ -167,7 +167,7 @@
         <w:jc w:val="center"/>
       </w:pPr>
       <w:r>
-        <w:t>Divyansh Vijay Mate — Roll No. 44</w:t>
+        <w:t>Divyansh Vijay Mate — Roll No. 45</w:t>
       </w:r>
     </w:p>
     <w:p>

</xml_diff>